<commit_message>
fix: Remove Lovable references from all docs; add tenant.admin test account
- Remove 'Lovable' branding from client-facing docs (Onboarding Spec,
  Survey Research Foundation, TestRail Scripts)
- Replace boost.lovable.app URLs with app.boostworkforce.com in Tech
  Spec and Implementation Plan
- Replace 'Built on Lovable (React/TypeScript)' with 'Built on
  React/TypeScript' in executive summary sections
- Replace 'Lovable Developer' with 'Platform Developer' throughout
  BSG Staff Training PPT (slides 31, 43)
- Add tenant.admin@boost.test (Tenant Admin, CCCOEO) to test account
  tables on slides 7, 39, 44 of BSG Staff Training PPT

Co-authored-by: Jackie Taylor <jpt@successladder.net>
</commit_message>
<xml_diff>
--- a/docs/BOOST_Phased_Implementation_Plan_v2.docx
+++ b/docs/BOOST_Phased_Implementation_Plan_v2.docx
@@ -474,7 +474,7 @@
           <w:sz w:val="18"/>
           <w:szCs w:val="18"/>
         </w:rPr>
-        <w:t xml:space="preserve">Built on Lovable (React/TypeScript) + Supabase</w:t>
+        <w:t xml:space="preserve">Built on React/TypeScript + Supabase</w:t>
       </w:r>
     </w:p>
     <w:p>
@@ -610,7 +610,7 @@
           <w:sz w:val="20"/>
           <w:szCs w:val="20"/>
         </w:rPr>
-        <w:t xml:space="preserve">Built on Lovable (React/TypeScript) with Supabase as the backend, BOOST! delivers real-time data, AI-assisted workflows, and deep tenant isolation in a platform that BSG can configure, white-label, and manage on behalf of clients.</w:t>
+        <w:t xml:space="preserve">Built on React/TypeScript with Supabase as the backend, BOOST! delivers real-time data, AI-assisted workflows, and deep tenant isolation in a platform that BSG can configure, white-label, and manage on behalf of clients.</w:t>
       </w:r>
     </w:p>
     <w:p>

</xml_diff>